<commit_message>
Fix Lab 12 cross-validation figure, real TOC field, README counts
- Lab 12 validation step told learners to expect Central at 111.9% of target,
  but the shipped kpi.csv gives 802.6/780 = 102.9%. A learner following the lab
  would have concluded their CORRECT dashboard failed validation — in the lab
  whose whole point is trusting your validation checks. Corrected to 102.9.
- inject_toc.py now wraps the page-numbered entries in a REAL Word TOC field
  (fldChar begin / TOC \o instruction / separate / cached entries / end), so
  Word and Google Docs can refresh it with F9 while every renderer still shows
  the correct page numbers LibreOffice cannot compute headless.
- Lab 8 troubleshooting no longer advises lowering the threshold to |z| > 2;
  it now matches the |z| > 3 standard taught everywhere else.
- README slide/page counts corrected to 214 slides and 45 pp.

Co-Authored-By: Claude Opus 5 (1M context) <noreply@anthropic.com>
</commit_message>
<xml_diff>
--- a/courseware/LG-WSQ - CompTIA Certified Data+ Training.docx
+++ b/courseware/LG-WSQ - CompTIA Certified Data+ Training.docx
@@ -477,6 +477,19 @@
       </w:r>
     </w:p>
     <w:p>
+      <w:r>
+        <w:fldChar w:fldCharType="begin"/>
+      </w:r>
+      <w:r>
+        <w:instrText xml:space="preserve"> TOC \o "1-3" \h \z \u </w:instrText>
+      </w:r>
+    </w:p>
+    <w:p>
+      <w:r>
+        <w:fldChar w:fldCharType="separate"/>
+      </w:r>
+    </w:p>
+    <w:p>
       <w:pPr>
         <w:tabs>
           <w:tab w:pos="9072" w:val="right" w:leader="dot"/>
@@ -983,6 +996,11 @@
         <w:t>Glossary</w:t>
         <w:tab/>
         <w:t>43</w:t>
+      </w:r>
+    </w:p>
+    <w:p>
+      <w:r>
+        <w:fldChar w:fldCharType="end"/>
       </w:r>
     </w:p>
     <w:p>
@@ -3833,7 +3851,7 @@
         <w:pStyle w:val="ListBullet"/>
       </w:pPr>
       <w:r>
-        <w:t>Only one row is flagged — That is correct — the dataset carries exactly one planted outlier (E999). Lower the threshold to |z| &gt; 2 and note that nothing else appears, which is what a clean distribution looks like.</w:t>
+        <w:t>Only one row is flagged — That is correct — the dataset carries exactly one planted outlier (E999) at z ≈ 7.5. Nothing else appears at |z| &gt; 3, which is what a clean distribution looks like.</w:t>
       </w:r>
     </w:p>
     <w:p>
@@ -5405,7 +5423,7 @@
           <w:color w:val="0B3060"/>
           <w:sz w:val="19"/>
         </w:rPr>
-        <w:t>python3 -c "import pandas as pd;d=pd.read_csv('kpi.csv');print('Central', round(d[d.region=='Central'].revenue.sum()/d[d.region=='Central'].target.sum()*100,1),'% expected 111.9')"</w:t>
+        <w:t>python3 -c "import pandas as pd;d=pd.read_csv('kpi.csv');print('Central', round(d[d.region=='Central'].revenue.sum()/d[d.region=='Central'].target.sum()*100,1),'% expected 102.9')"</w:t>
       </w:r>
     </w:p>
     <w:p>

</xml_diff>